<commit_message>
test better formatting in function manual pages
</commit_message>
<xml_diff>
--- a/dev/rebuild package/rebuild.docx
+++ b/dev/rebuild package/rebuild.docx
@@ -1,6 +1,6 @@
 
 <file path=word/document.xml><?xml version="1.0" encoding="utf-8"?>
-<w:document xmlns:wpc="http://schemas.microsoft.com/office/word/2010/wordprocessingCanvas" xmlns:cx="http://schemas.microsoft.com/office/drawing/2014/chartex" xmlns:cx1="http://schemas.microsoft.com/office/drawing/2015/9/8/chartex" xmlns:cx2="http://schemas.microsoft.com/office/drawing/2015/10/21/chartex" xmlns:cx3="http://schemas.microsoft.com/office/drawing/2016/5/9/chartex" xmlns:cx4="http://schemas.microsoft.com/office/drawing/2016/5/10/chartex" xmlns:cx5="http://schemas.microsoft.com/office/drawing/2016/5/11/chartex" xmlns:cx6="http://schemas.microsoft.com/office/drawing/2016/5/12/chartex" xmlns:cx7="http://schemas.microsoft.com/office/drawing/2016/5/13/chartex" xmlns:cx8="http://schemas.microsoft.com/office/drawing/2016/5/14/chartex" xmlns:mc="http://schemas.openxmlformats.org/markup-compatibility/2006" xmlns:aink="http://schemas.microsoft.com/office/drawing/2016/ink" xmlns:am3d="http://schemas.microsoft.com/office/drawing/2017/model3d" xmlns:o="urn:schemas-microsoft-com:office:office" xmlns:oel="http://schemas.microsoft.com/office/2019/extlst" xmlns:r="http://schemas.openxmlformats.org/officeDocument/2006/relationships" xmlns:m="http://schemas.openxmlformats.org/officeDocument/2006/math" xmlns:v="urn:schemas-microsoft-com:vml" xmlns:wp14="http://schemas.microsoft.com/office/word/2010/wordprocessingDrawing" xmlns:wp="http://schemas.openxmlformats.org/drawingml/2006/wordprocessingDrawing" xmlns:w10="urn:schemas-microsoft-com:office:word" xmlns:w="http://schemas.openxmlformats.org/wordprocessingml/2006/main" xmlns:w14="http://schemas.microsoft.com/office/word/2010/wordml" xmlns:w15="http://schemas.microsoft.com/office/word/2012/wordml" xmlns:w16cex="http://schemas.microsoft.com/office/word/2018/wordml/cex" xmlns:w16cid="http://schemas.microsoft.com/office/word/2016/wordml/cid" xmlns:w16="http://schemas.microsoft.com/office/word/2018/wordml" xmlns:w16du="http://schemas.microsoft.com/office/word/2023/wordml/word16du" xmlns:w16sdtdh="http://schemas.microsoft.com/office/word/2020/wordml/sdtdatahash" xmlns:w16se="http://schemas.microsoft.com/office/word/2015/wordml/symex" xmlns:wpg="http://schemas.microsoft.com/office/word/2010/wordprocessingGroup" xmlns:wpi="http://schemas.microsoft.com/office/word/2010/wordprocessingInk" xmlns:wne="http://schemas.microsoft.com/office/word/2006/wordml" xmlns:wps="http://schemas.microsoft.com/office/word/2010/wordprocessingShape" mc:Ignorable="w14 w15 w16se w16cid w16 w16cex w16sdtdh w16du wp14">
+<w:document xmlns:wpc="http://schemas.microsoft.com/office/word/2010/wordprocessingCanvas" xmlns:cx="http://schemas.microsoft.com/office/drawing/2014/chartex" xmlns:cx1="http://schemas.microsoft.com/office/drawing/2015/9/8/chartex" xmlns:cx2="http://schemas.microsoft.com/office/drawing/2015/10/21/chartex" xmlns:cx3="http://schemas.microsoft.com/office/drawing/2016/5/9/chartex" xmlns:cx4="http://schemas.microsoft.com/office/drawing/2016/5/10/chartex" xmlns:cx5="http://schemas.microsoft.com/office/drawing/2016/5/11/chartex" xmlns:cx6="http://schemas.microsoft.com/office/drawing/2016/5/12/chartex" xmlns:cx7="http://schemas.microsoft.com/office/drawing/2016/5/13/chartex" xmlns:cx8="http://schemas.microsoft.com/office/drawing/2016/5/14/chartex" xmlns:mc="http://schemas.openxmlformats.org/markup-compatibility/2006" xmlns:aink="http://schemas.microsoft.com/office/drawing/2016/ink" xmlns:am3d="http://schemas.microsoft.com/office/drawing/2017/model3d" xmlns:o="urn:schemas-microsoft-com:office:office" xmlns:oel="http://schemas.microsoft.com/office/2019/extlst" xmlns:r="http://schemas.openxmlformats.org/officeDocument/2006/relationships" xmlns:m="http://schemas.openxmlformats.org/officeDocument/2006/math" xmlns:v="urn:schemas-microsoft-com:vml" xmlns:wp14="http://schemas.microsoft.com/office/word/2010/wordprocessingDrawing" xmlns:wp="http://schemas.openxmlformats.org/drawingml/2006/wordprocessingDrawing" xmlns:w10="urn:schemas-microsoft-com:office:word" xmlns:w="http://schemas.openxmlformats.org/wordprocessingml/2006/main" xmlns:w14="http://schemas.microsoft.com/office/word/2010/wordml" xmlns:w15="http://schemas.microsoft.com/office/word/2012/wordml" xmlns:w16cex="http://schemas.microsoft.com/office/word/2018/wordml/cex" xmlns:w16cid="http://schemas.microsoft.com/office/word/2016/wordml/cid" xmlns:w16="http://schemas.microsoft.com/office/word/2018/wordml" xmlns:w16du="http://schemas.microsoft.com/office/word/2023/wordml/word16du" xmlns:w16sdtdh="http://schemas.microsoft.com/office/word/2020/wordml/sdtdatahash" xmlns:w16sdtfl="http://schemas.microsoft.com/office/word/2024/wordml/sdtformatlock" xmlns:w16se="http://schemas.microsoft.com/office/word/2015/wordml/symex" xmlns:wpg="http://schemas.microsoft.com/office/word/2010/wordprocessingGroup" xmlns:wpi="http://schemas.microsoft.com/office/word/2010/wordprocessingInk" xmlns:wne="http://schemas.microsoft.com/office/word/2006/wordml" xmlns:wps="http://schemas.microsoft.com/office/word/2010/wordprocessingShape" mc:Ignorable="w14 w15 w16se w16cid w16 w16cex w16sdtdh w16sdtfl w16du wp14">
   <w:body>
     <w:p>
       <w:pPr>
@@ -8,27 +8,19 @@
           <w:lang w:val="fr-FR"/>
         </w:rPr>
       </w:pPr>
-    </w:p>
-    <w:p>
-      <w:pPr>
+      <w:r>
         <w:rPr>
           <w:lang w:val="fr-FR"/>
         </w:rPr>
-      </w:pPr>
-      <w:r>
-        <w:rPr>
-          <w:lang w:val="fr-FR"/>
-        </w:rPr>
+        <w:t>Open R as admin</w:t>
+      </w:r>
+    </w:p>
+    <w:p>
+      <w:r>
         <w:t>Warning : change package name everywhere</w:t>
       </w:r>
     </w:p>
-    <w:p>
-      <w:pPr>
-        <w:rPr>
-          <w:lang w:val="fr-FR"/>
-        </w:rPr>
-      </w:pPr>
-    </w:p>
+    <w:p/>
     <w:p>
       <w:pPr>
         <w:shd w:val="clear" w:color="auto" w:fill="272822"/>
@@ -95,20 +87,11 @@
         <w:t>)</w:t>
       </w:r>
     </w:p>
-    <w:p>
-      <w:pPr>
-        <w:rPr>
-          <w:lang w:val="fr-FR"/>
-        </w:rPr>
-      </w:pPr>
-    </w:p>
-    <w:p>
-      <w:pPr>
-        <w:shd w:val="clear" w:color="auto" w:fill="272822"/>
-        <w:spacing w:line="285" w:lineRule="atLeast"/>
-        <w:rPr>
-          <w:lang w:val="fr-FR"/>
-        </w:rPr>
+    <w:p/>
+    <w:p>
+      <w:pPr>
+        <w:shd w:val="clear" w:color="auto" w:fill="272822"/>
+        <w:spacing w:line="285" w:lineRule="atLeast"/>
       </w:pPr>
       <w:bookmarkStart w:id="0" w:name="_Hlk176437110"/>
     </w:p>
@@ -611,54 +594,33 @@
     <w:p>
       <w:pPr>
         <w:ind w:left="567" w:hanging="567"/>
-        <w:rPr>
-          <w:lang w:val="fr-FR"/>
-        </w:rPr>
       </w:pPr>
     </w:p>
     <w:p>
       <w:pPr>
         <w:ind w:left="567" w:hanging="567"/>
-        <w:rPr>
-          <w:lang w:val="fr-FR"/>
-        </w:rPr>
-      </w:pPr>
-      <w:r>
-        <w:rPr>
-          <w:lang w:val="fr-FR"/>
-        </w:rPr>
+      </w:pPr>
+      <w:r>
         <w:t>Keep only the R folder and Empty the man folder</w:t>
       </w:r>
     </w:p>
     <w:p>
       <w:pPr>
         <w:ind w:left="567" w:hanging="567"/>
-        <w:rPr>
-          <w:lang w:val="fr-FR"/>
-        </w:rPr>
-      </w:pPr>
-      <w:r>
-        <w:rPr>
-          <w:lang w:val="fr-FR"/>
-        </w:rPr>
+      </w:pPr>
+      <w:r>
         <w:t>Replace the DESCRIPTION FILE</w:t>
       </w:r>
     </w:p>
     <w:p>
       <w:pPr>
         <w:ind w:left="567" w:hanging="567"/>
-        <w:rPr>
-          <w:lang w:val="fr-FR"/>
-        </w:rPr>
-      </w:pPr>
-    </w:p>
-    <w:p>
-      <w:pPr>
-        <w:shd w:val="clear" w:color="auto" w:fill="272822"/>
-        <w:spacing w:line="285" w:lineRule="atLeast"/>
-        <w:rPr>
-          <w:lang w:val="fr-FR"/>
-        </w:rPr>
+      </w:pPr>
+    </w:p>
+    <w:p>
+      <w:pPr>
+        <w:shd w:val="clear" w:color="auto" w:fill="272822"/>
+        <w:spacing w:line="285" w:lineRule="atLeast"/>
       </w:pPr>
       <w:bookmarkStart w:id="1" w:name="_Hlk176357231"/>
     </w:p>
@@ -2651,103 +2613,53 @@
       </w:r>
     </w:p>
     <w:bookmarkEnd w:id="2"/>
-    <w:p>
-      <w:pPr>
-        <w:rPr>
-          <w:lang w:val="fr-FR"/>
-        </w:rPr>
-      </w:pPr>
-    </w:p>
-    <w:p>
-      <w:pPr>
-        <w:rPr>
-          <w:lang w:val="fr-FR"/>
-        </w:rPr>
-      </w:pPr>
-      <w:r>
-        <w:rPr>
-          <w:lang w:val="fr-FR"/>
-        </w:rPr>
+    <w:p/>
+    <w:p>
+      <w:r>
         <w:t>Add in DESCRIPTION:</w:t>
       </w:r>
     </w:p>
     <w:p>
       <w:pPr>
         <w:ind w:left="1134"/>
-        <w:rPr>
-          <w:lang w:val="fr-FR"/>
-        </w:rPr>
-      </w:pPr>
-      <w:r>
-        <w:rPr>
-          <w:lang w:val="fr-FR"/>
-        </w:rPr>
+      </w:pPr>
+      <w:r>
         <w:t xml:space="preserve">Suggests: </w:t>
       </w:r>
     </w:p>
     <w:p>
       <w:pPr>
         <w:ind w:left="1134"/>
-        <w:rPr>
-          <w:lang w:val="fr-FR"/>
-        </w:rPr>
-      </w:pPr>
-      <w:r>
-        <w:rPr>
-          <w:lang w:val="fr-FR"/>
-        </w:rPr>
+      </w:pPr>
+      <w:r>
         <w:t xml:space="preserve">    knitr,</w:t>
       </w:r>
     </w:p>
     <w:p>
       <w:pPr>
         <w:ind w:left="1134"/>
-        <w:rPr>
-          <w:lang w:val="fr-FR"/>
-        </w:rPr>
-      </w:pPr>
-      <w:r>
-        <w:rPr>
-          <w:lang w:val="fr-FR"/>
-        </w:rPr>
+      </w:pPr>
+      <w:r>
         <w:t xml:space="preserve">    rmarkdown,</w:t>
       </w:r>
     </w:p>
     <w:p>
       <w:pPr>
         <w:ind w:left="1134"/>
-        <w:rPr>
-          <w:lang w:val="fr-FR"/>
-        </w:rPr>
-      </w:pPr>
-      <w:r>
-        <w:rPr>
-          <w:lang w:val="fr-FR"/>
-        </w:rPr>
+      </w:pPr>
+      <w:r>
         <w:t xml:space="preserve">    testthat (&gt;= 3.0.0)</w:t>
       </w:r>
     </w:p>
     <w:p>
       <w:pPr>
         <w:ind w:left="1134"/>
-        <w:rPr>
-          <w:lang w:val="fr-FR"/>
-        </w:rPr>
-      </w:pPr>
-      <w:r>
-        <w:rPr>
-          <w:lang w:val="fr-FR"/>
-        </w:rPr>
+      </w:pPr>
+      <w:r>
         <w:t>VignetteBuilder: knitr</w:t>
       </w:r>
     </w:p>
-    <w:p>
-      <w:pPr>
-        <w:rPr>
-          <w:lang w:val="fr-FR"/>
-        </w:rPr>
-      </w:pPr>
-    </w:p>
+    <w:p/>
     <w:p>
       <w:pPr>
         <w:shd w:val="clear" w:color="auto" w:fill="272822"/>
@@ -2808,7 +2720,7 @@
 </file>
 
 <file path=word/numbering.xml><?xml version="1.0" encoding="utf-8"?>
-<w:numbering xmlns:wpc="http://schemas.microsoft.com/office/word/2010/wordprocessingCanvas" xmlns:cx="http://schemas.microsoft.com/office/drawing/2014/chartex" xmlns:cx1="http://schemas.microsoft.com/office/drawing/2015/9/8/chartex" xmlns:cx2="http://schemas.microsoft.com/office/drawing/2015/10/21/chartex" xmlns:cx3="http://schemas.microsoft.com/office/drawing/2016/5/9/chartex" xmlns:cx4="http://schemas.microsoft.com/office/drawing/2016/5/10/chartex" xmlns:cx5="http://schemas.microsoft.com/office/drawing/2016/5/11/chartex" xmlns:cx6="http://schemas.microsoft.com/office/drawing/2016/5/12/chartex" xmlns:cx7="http://schemas.microsoft.com/office/drawing/2016/5/13/chartex" xmlns:cx8="http://schemas.microsoft.com/office/drawing/2016/5/14/chartex" xmlns:mc="http://schemas.openxmlformats.org/markup-compatibility/2006" xmlns:aink="http://schemas.microsoft.com/office/drawing/2016/ink" xmlns:am3d="http://schemas.microsoft.com/office/drawing/2017/model3d" xmlns:o="urn:schemas-microsoft-com:office:office" xmlns:oel="http://schemas.microsoft.com/office/2019/extlst" xmlns:r="http://schemas.openxmlformats.org/officeDocument/2006/relationships" xmlns:m="http://schemas.openxmlformats.org/officeDocument/2006/math" xmlns:v="urn:schemas-microsoft-com:vml" xmlns:wp14="http://schemas.microsoft.com/office/word/2010/wordprocessingDrawing" xmlns:wp="http://schemas.openxmlformats.org/drawingml/2006/wordprocessingDrawing" xmlns:w10="urn:schemas-microsoft-com:office:word" xmlns:w="http://schemas.openxmlformats.org/wordprocessingml/2006/main" xmlns:w14="http://schemas.microsoft.com/office/word/2010/wordml" xmlns:w15="http://schemas.microsoft.com/office/word/2012/wordml" xmlns:w16cex="http://schemas.microsoft.com/office/word/2018/wordml/cex" xmlns:w16cid="http://schemas.microsoft.com/office/word/2016/wordml/cid" xmlns:w16="http://schemas.microsoft.com/office/word/2018/wordml" xmlns:w16du="http://schemas.microsoft.com/office/word/2023/wordml/word16du" xmlns:w16sdtdh="http://schemas.microsoft.com/office/word/2020/wordml/sdtdatahash" xmlns:w16se="http://schemas.microsoft.com/office/word/2015/wordml/symex" xmlns:wpg="http://schemas.microsoft.com/office/word/2010/wordprocessingGroup" xmlns:wpi="http://schemas.microsoft.com/office/word/2010/wordprocessingInk" xmlns:wne="http://schemas.microsoft.com/office/word/2006/wordml" xmlns:wps="http://schemas.microsoft.com/office/word/2010/wordprocessingShape" mc:Ignorable="w14 w15 w16se w16cid w16 w16cex w16sdtdh w16du wp14">
+<w:numbering xmlns:wpc="http://schemas.microsoft.com/office/word/2010/wordprocessingCanvas" xmlns:cx="http://schemas.microsoft.com/office/drawing/2014/chartex" xmlns:cx1="http://schemas.microsoft.com/office/drawing/2015/9/8/chartex" xmlns:cx2="http://schemas.microsoft.com/office/drawing/2015/10/21/chartex" xmlns:cx3="http://schemas.microsoft.com/office/drawing/2016/5/9/chartex" xmlns:cx4="http://schemas.microsoft.com/office/drawing/2016/5/10/chartex" xmlns:cx5="http://schemas.microsoft.com/office/drawing/2016/5/11/chartex" xmlns:cx6="http://schemas.microsoft.com/office/drawing/2016/5/12/chartex" xmlns:cx7="http://schemas.microsoft.com/office/drawing/2016/5/13/chartex" xmlns:cx8="http://schemas.microsoft.com/office/drawing/2016/5/14/chartex" xmlns:mc="http://schemas.openxmlformats.org/markup-compatibility/2006" xmlns:aink="http://schemas.microsoft.com/office/drawing/2016/ink" xmlns:am3d="http://schemas.microsoft.com/office/drawing/2017/model3d" xmlns:o="urn:schemas-microsoft-com:office:office" xmlns:oel="http://schemas.microsoft.com/office/2019/extlst" xmlns:r="http://schemas.openxmlformats.org/officeDocument/2006/relationships" xmlns:m="http://schemas.openxmlformats.org/officeDocument/2006/math" xmlns:v="urn:schemas-microsoft-com:vml" xmlns:wp14="http://schemas.microsoft.com/office/word/2010/wordprocessingDrawing" xmlns:wp="http://schemas.openxmlformats.org/drawingml/2006/wordprocessingDrawing" xmlns:w10="urn:schemas-microsoft-com:office:word" xmlns:w="http://schemas.openxmlformats.org/wordprocessingml/2006/main" xmlns:w14="http://schemas.microsoft.com/office/word/2010/wordml" xmlns:w15="http://schemas.microsoft.com/office/word/2012/wordml" xmlns:w16cex="http://schemas.microsoft.com/office/word/2018/wordml/cex" xmlns:w16cid="http://schemas.microsoft.com/office/word/2016/wordml/cid" xmlns:w16="http://schemas.microsoft.com/office/word/2018/wordml" xmlns:w16du="http://schemas.microsoft.com/office/word/2023/wordml/word16du" xmlns:w16sdtdh="http://schemas.microsoft.com/office/word/2020/wordml/sdtdatahash" xmlns:w16sdtfl="http://schemas.microsoft.com/office/word/2024/wordml/sdtformatlock" xmlns:w16se="http://schemas.microsoft.com/office/word/2015/wordml/symex" xmlns:wpg="http://schemas.microsoft.com/office/word/2010/wordprocessingGroup" xmlns:wpi="http://schemas.microsoft.com/office/word/2010/wordprocessingInk" xmlns:wne="http://schemas.microsoft.com/office/word/2006/wordml" xmlns:wps="http://schemas.microsoft.com/office/word/2010/wordprocessingShape" mc:Ignorable="w14 w15 w16se w16cid w16 w16cex w16sdtdh w16sdtfl w16du wp14">
   <w:abstractNum w:abstractNumId="0" w15:restartNumberingAfterBreak="0">
     <w:nsid w:val="0E36669C"/>
     <w:multiLevelType w:val="hybridMultilevel"/>
@@ -3143,7 +3055,7 @@
 </file>
 
 <file path=word/styles.xml><?xml version="1.0" encoding="utf-8"?>
-<w:styles xmlns:mc="http://schemas.openxmlformats.org/markup-compatibility/2006" xmlns:r="http://schemas.openxmlformats.org/officeDocument/2006/relationships" xmlns:w="http://schemas.openxmlformats.org/wordprocessingml/2006/main" xmlns:w14="http://schemas.microsoft.com/office/word/2010/wordml" xmlns:w15="http://schemas.microsoft.com/office/word/2012/wordml" xmlns:w16cex="http://schemas.microsoft.com/office/word/2018/wordml/cex" xmlns:w16cid="http://schemas.microsoft.com/office/word/2016/wordml/cid" xmlns:w16="http://schemas.microsoft.com/office/word/2018/wordml" xmlns:w16du="http://schemas.microsoft.com/office/word/2023/wordml/word16du" xmlns:w16sdtdh="http://schemas.microsoft.com/office/word/2020/wordml/sdtdatahash" xmlns:w16se="http://schemas.microsoft.com/office/word/2015/wordml/symex" mc:Ignorable="w14 w15 w16se w16cid w16 w16cex w16sdtdh w16du">
+<w:styles xmlns:mc="http://schemas.openxmlformats.org/markup-compatibility/2006" xmlns:r="http://schemas.openxmlformats.org/officeDocument/2006/relationships" xmlns:w="http://schemas.openxmlformats.org/wordprocessingml/2006/main" xmlns:w14="http://schemas.microsoft.com/office/word/2010/wordml" xmlns:w15="http://schemas.microsoft.com/office/word/2012/wordml" xmlns:w16cex="http://schemas.microsoft.com/office/word/2018/wordml/cex" xmlns:w16cid="http://schemas.microsoft.com/office/word/2016/wordml/cid" xmlns:w16="http://schemas.microsoft.com/office/word/2018/wordml" xmlns:w16du="http://schemas.microsoft.com/office/word/2023/wordml/word16du" xmlns:w16sdtdh="http://schemas.microsoft.com/office/word/2020/wordml/sdtdatahash" xmlns:w16sdtfl="http://schemas.microsoft.com/office/word/2024/wordml/sdtformatlock" xmlns:w16se="http://schemas.microsoft.com/office/word/2015/wordml/symex" mc:Ignorable="w14 w15 w16se w16cid w16 w16cex w16sdtdh w16sdtfl w16du">
   <w:docDefaults>
     <w:rPrDefault>
       <w:rPr>

</xml_diff>